<commit_message>
Malderus: remove stray transcriber end-note from entry files
Co-Authored-By: Claude Fable 5 <noreply@anthropic.com>
Claude-Session: https://claude.ai/code/session_01QEPso8ntskGCmG2j9vjV5r
</commit_message>
<xml_diff>
--- a/1616 Malderus/1616_Malderus_EN_WORD.docx
+++ b/1616 Malderus/1616_Malderus_EN_WORD.docx
@@ -852,14 +852,6 @@
       </w:pPr>
       <w:r>
         <w:t xml:space="preserve">I answer, therefore, rather by denying the consequence. For in order that what the Pope determines be of faith, it is not required that it be of divine faith that he who determines is the true Pontiff; it suffices that this be most certain. Now it is most certain that he whom the universal Church receives as Pontiff is the true Pontiff. For it pertains to the providence of God to prevent the Church from being deceived in a judgment of this kind. In vain, therefore, do new men, certain blasphemous apostates, raise a doubt about the legitimate election of the Pontiffs of this age, whom they have found adverse to themselves. Received by the Catholic Church, they are beyond the hazard of this calumny. But that it suffices that it be altogether certain, even if it be not of faith, I prove: Because the certitude of faith depends on the veracity of God saying that which is believed; but the Pope does not make new articles of faith, but only proposes that God at some time said this or that. Now it was said above that, in those things which concur to the proposition and credibility of the faith, a certitude in all respects equal to the certitude of faith is not to be demanded; but that it suffices that the credibility be made evident through arguments of such a kind as indeed cannot deceive, yet are not believed by divine faith. For this suffices not only for the infallibility of faith, but also for the obligation; so that he who does not believe incurs the sin of heresy or of infidelity.</w:t>
-      </w:r>
-    </w:p>
-    <w:p>
-      <w:pPr>
-        <w:pStyle w:val="BodyText"/>
-      </w:pPr>
-      <w:r>
-        <w:t xml:space="preserve">[Ends before DISPVTATIO VI. on printed p. 44.]</w:t>
       </w:r>
     </w:p>
     <w:bookmarkEnd w:id="21"/>

</xml_diff>